<commit_message>
Se elimina marcado en amarillo de los formatos.
</commit_message>
<xml_diff>
--- a/formatos/formatos_cesiones_mx/cesion_fisica_a_fisica_mx.docx
+++ b/formatos/formatos_cesiones_mx/cesion_fisica_a_fisica_mx.docx
@@ -36,61 +36,105 @@
           <w:b/>
           <w:sz w:val="21"/>
           <w:szCs w:val="21"/>
-          <w:highlight w:val="yellow"/>
-        </w:rPr>
-        <w:t xml:space="preserve">{{ </w:t>
-      </w:r>
-      <w:proofErr w:type="spellStart"/>
+        </w:rPr>
+        <w:t>{{ NOMBRE_CEDENTE|upper }}</w:t>
+      </w:r>
+      <w:r>
+        <w:rPr>
+          <w:rFonts w:ascii="Garamond" w:eastAsia="Garamond" w:hAnsi="Garamond" w:cs="Garamond"/>
+          <w:b/>
+          <w:bCs/>
+          <w:sz w:val="20"/>
+          <w:szCs w:val="20"/>
+        </w:rPr>
+        <w:t>, CON REGISTRO FEDERAL DE CONTRIBUYENTES {{</w:t>
+      </w:r>
+      <w:r>
+        <w:rPr>
+          <w:rFonts w:ascii="Garamond" w:eastAsia="Garamond" w:hAnsi="Garamond" w:cs="Garamond"/>
+          <w:b/>
+          <w:bCs/>
+          <w:sz w:val="20"/>
+          <w:szCs w:val="20"/>
+        </w:rPr>
+        <w:t xml:space="preserve"> </w:t>
+      </w:r>
+      <w:r>
+        <w:rPr>
+          <w:rFonts w:ascii="Garamond" w:eastAsia="Garamond" w:hAnsi="Garamond" w:cs="Garamond"/>
+          <w:b/>
+          <w:bCs/>
+          <w:sz w:val="20"/>
+          <w:szCs w:val="20"/>
+        </w:rPr>
+        <w:t>CEDENTE_RFC</w:t>
+      </w:r>
+      <w:r>
+        <w:rPr>
+          <w:rFonts w:ascii="Garamond" w:eastAsia="Garamond" w:hAnsi="Garamond" w:cs="Garamond"/>
+          <w:b/>
+          <w:bCs/>
+          <w:sz w:val="20"/>
+          <w:szCs w:val="20"/>
+        </w:rPr>
+        <w:t xml:space="preserve"> </w:t>
+      </w:r>
+      <w:r>
+        <w:rPr>
+          <w:rFonts w:ascii="Garamond" w:eastAsia="Garamond" w:hAnsi="Garamond" w:cs="Garamond"/>
+          <w:b/>
+          <w:bCs/>
+          <w:sz w:val="20"/>
+          <w:szCs w:val="20"/>
+        </w:rPr>
+        <w:t>}},</w:t>
+      </w:r>
+      <w:r>
+        <w:rPr>
+          <w:rFonts w:ascii="Garamond" w:eastAsia="Garamond" w:hAnsi="Garamond" w:cs="Garamond"/>
+          <w:b/>
+          <w:bCs/>
+          <w:sz w:val="20"/>
+          <w:szCs w:val="20"/>
+        </w:rPr>
+        <w:t xml:space="preserve"> </w:t>
+      </w:r>
+      <w:r>
+        <w:rPr>
+          <w:rFonts w:ascii="Garamond" w:eastAsia="Garamond" w:hAnsi="Garamond" w:cs="Garamond"/>
+          <w:b/>
+          <w:bCs/>
+          <w:sz w:val="20"/>
+          <w:szCs w:val="20"/>
+        </w:rPr>
+        <w:t xml:space="preserve">(EN ADELANTE, EL “CEDENTE”); POR OTRA PARTE, </w:t>
+      </w:r>
       <w:r>
         <w:rPr>
           <w:rFonts w:ascii="Garamond" w:eastAsia="Garamond" w:hAnsi="Garamond" w:cs="Garamond"/>
           <w:b/>
           <w:sz w:val="21"/>
           <w:szCs w:val="21"/>
-          <w:highlight w:val="yellow"/>
-        </w:rPr>
-        <w:t>NOMBRE_CEDENTE|upper</w:t>
-      </w:r>
-      <w:proofErr w:type="spellEnd"/>
-      <w:r>
-        <w:rPr>
-          <w:rFonts w:ascii="Garamond" w:eastAsia="Garamond" w:hAnsi="Garamond" w:cs="Garamond"/>
-          <w:b/>
-          <w:sz w:val="21"/>
-          <w:szCs w:val="21"/>
-          <w:highlight w:val="yellow"/>
-        </w:rPr>
-        <w:t xml:space="preserve"> }}</w:t>
-      </w:r>
-      <w:r>
-        <w:rPr>
-          <w:rFonts w:ascii="Garamond" w:eastAsia="Garamond" w:hAnsi="Garamond" w:cs="Garamond"/>
-          <w:b/>
-          <w:bCs/>
-          <w:sz w:val="20"/>
-          <w:szCs w:val="20"/>
-        </w:rPr>
-        <w:t xml:space="preserve">, CON REGISTRO FEDERAL DE CONTRIBUYENTES </w:t>
-      </w:r>
-      <w:r>
-        <w:rPr>
-          <w:rFonts w:ascii="Garamond" w:eastAsia="Garamond" w:hAnsi="Garamond" w:cs="Garamond"/>
-          <w:b/>
-          <w:bCs/>
-          <w:sz w:val="20"/>
-          <w:szCs w:val="20"/>
-          <w:highlight w:val="yellow"/>
-        </w:rPr>
-        <w:t>{{</w:t>
-      </w:r>
-      <w:r>
-        <w:rPr>
-          <w:rFonts w:ascii="Garamond" w:eastAsia="Garamond" w:hAnsi="Garamond" w:cs="Garamond"/>
-          <w:b/>
-          <w:bCs/>
-          <w:sz w:val="20"/>
-          <w:szCs w:val="20"/>
-          <w:highlight w:val="yellow"/>
+        </w:rPr>
+        <w:t>{{ NOMBRE_CESIONARIO|upper  }}</w:t>
+      </w:r>
+      <w:r>
+        <w:rPr>
+          <w:rFonts w:ascii="Garamond" w:eastAsia="Garamond" w:hAnsi="Garamond" w:cs="Garamond"/>
+          <w:b/>
+          <w:bCs/>
+          <w:sz w:val="20"/>
+          <w:szCs w:val="20"/>
+        </w:rPr>
+        <w:t>, CON REGISTRO FEDERAL DE CONTRIBUYENTES {{</w:t>
+      </w:r>
+      <w:r>
+        <w:rPr>
+          <w:rFonts w:ascii="Garamond" w:eastAsia="Garamond" w:hAnsi="Garamond" w:cs="Garamond"/>
+          <w:b/>
+          <w:bCs/>
+          <w:sz w:val="20"/>
+          <w:szCs w:val="20"/>
         </w:rPr>
         <w:t xml:space="preserve"> </w:t>
       </w:r>
@@ -101,18 +145,16 @@
           <w:bCs/>
           <w:sz w:val="20"/>
           <w:szCs w:val="20"/>
-          <w:highlight w:val="yellow"/>
-        </w:rPr>
-        <w:t>CEDENTE_RFC</w:t>
-      </w:r>
-      <w:r>
-        <w:rPr>
-          <w:rFonts w:ascii="Garamond" w:eastAsia="Garamond" w:hAnsi="Garamond" w:cs="Garamond"/>
-          <w:b/>
-          <w:bCs/>
-          <w:sz w:val="20"/>
-          <w:szCs w:val="20"/>
-          <w:highlight w:val="yellow"/>
+        </w:rPr>
+        <w:t>CESIONARIO_RFC</w:t>
+      </w:r>
+      <w:r>
+        <w:rPr>
+          <w:rFonts w:ascii="Garamond" w:eastAsia="Garamond" w:hAnsi="Garamond" w:cs="Garamond"/>
+          <w:b/>
+          <w:bCs/>
+          <w:sz w:val="20"/>
+          <w:szCs w:val="20"/>
         </w:rPr>
         <w:t xml:space="preserve"> </w:t>
       </w:r>
@@ -123,19 +165,8 @@
           <w:bCs/>
           <w:sz w:val="20"/>
           <w:szCs w:val="20"/>
-          <w:highlight w:val="yellow"/>
-        </w:rPr>
-        <w:t>}}</w:t>
-      </w:r>
-      <w:r>
-        <w:rPr>
-          <w:rFonts w:ascii="Garamond" w:eastAsia="Garamond" w:hAnsi="Garamond" w:cs="Garamond"/>
-          <w:b/>
-          <w:bCs/>
-          <w:sz w:val="20"/>
-          <w:szCs w:val="20"/>
-        </w:rPr>
-        <w:t>,</w:t>
+        </w:rPr>
+        <w:t>}},</w:t>
       </w:r>
       <w:r>
         <w:rPr>
@@ -155,133 +186,6 @@
           <w:sz w:val="20"/>
           <w:szCs w:val="20"/>
         </w:rPr>
-        <w:t xml:space="preserve">(EN ADELANTE, EL “CEDENTE”); POR OTRA PARTE, </w:t>
-      </w:r>
-      <w:r>
-        <w:rPr>
-          <w:rFonts w:ascii="Garamond" w:eastAsia="Garamond" w:hAnsi="Garamond" w:cs="Garamond"/>
-          <w:b/>
-          <w:sz w:val="21"/>
-          <w:szCs w:val="21"/>
-          <w:highlight w:val="yellow"/>
-        </w:rPr>
-        <w:t xml:space="preserve">{{ </w:t>
-      </w:r>
-      <w:proofErr w:type="spellStart"/>
-      <w:r>
-        <w:rPr>
-          <w:rFonts w:ascii="Garamond" w:eastAsia="Garamond" w:hAnsi="Garamond" w:cs="Garamond"/>
-          <w:b/>
-          <w:sz w:val="21"/>
-          <w:szCs w:val="21"/>
-          <w:highlight w:val="yellow"/>
-        </w:rPr>
-        <w:t>NOMBRE_CESIONARIO|upper</w:t>
-      </w:r>
-      <w:proofErr w:type="spellEnd"/>
-      <w:r>
-        <w:rPr>
-          <w:rFonts w:ascii="Garamond" w:eastAsia="Garamond" w:hAnsi="Garamond" w:cs="Garamond"/>
-          <w:b/>
-          <w:sz w:val="21"/>
-          <w:szCs w:val="21"/>
-          <w:highlight w:val="yellow"/>
-        </w:rPr>
-        <w:t xml:space="preserve">  }}</w:t>
-      </w:r>
-      <w:r>
-        <w:rPr>
-          <w:rFonts w:ascii="Garamond" w:eastAsia="Garamond" w:hAnsi="Garamond" w:cs="Garamond"/>
-          <w:b/>
-          <w:bCs/>
-          <w:sz w:val="20"/>
-          <w:szCs w:val="20"/>
-        </w:rPr>
-        <w:t xml:space="preserve">, CON REGISTRO FEDERAL DE CONTRIBUYENTES </w:t>
-      </w:r>
-      <w:r>
-        <w:rPr>
-          <w:rFonts w:ascii="Garamond" w:eastAsia="Garamond" w:hAnsi="Garamond" w:cs="Garamond"/>
-          <w:b/>
-          <w:bCs/>
-          <w:sz w:val="20"/>
-          <w:szCs w:val="20"/>
-          <w:highlight w:val="yellow"/>
-        </w:rPr>
-        <w:t>{{</w:t>
-      </w:r>
-      <w:r>
-        <w:rPr>
-          <w:rFonts w:ascii="Garamond" w:eastAsia="Garamond" w:hAnsi="Garamond" w:cs="Garamond"/>
-          <w:b/>
-          <w:bCs/>
-          <w:sz w:val="20"/>
-          <w:szCs w:val="20"/>
-          <w:highlight w:val="yellow"/>
-        </w:rPr>
-        <w:t xml:space="preserve"> </w:t>
-      </w:r>
-      <w:r>
-        <w:rPr>
-          <w:rFonts w:ascii="Garamond" w:eastAsia="Garamond" w:hAnsi="Garamond" w:cs="Garamond"/>
-          <w:b/>
-          <w:bCs/>
-          <w:sz w:val="20"/>
-          <w:szCs w:val="20"/>
-          <w:highlight w:val="yellow"/>
-        </w:rPr>
-        <w:t>CESIONARIO_RFC</w:t>
-      </w:r>
-      <w:r>
-        <w:rPr>
-          <w:rFonts w:ascii="Garamond" w:eastAsia="Garamond" w:hAnsi="Garamond" w:cs="Garamond"/>
-          <w:b/>
-          <w:bCs/>
-          <w:sz w:val="20"/>
-          <w:szCs w:val="20"/>
-          <w:highlight w:val="yellow"/>
-        </w:rPr>
-        <w:t xml:space="preserve"> </w:t>
-      </w:r>
-      <w:r>
-        <w:rPr>
-          <w:rFonts w:ascii="Garamond" w:eastAsia="Garamond" w:hAnsi="Garamond" w:cs="Garamond"/>
-          <w:b/>
-          <w:bCs/>
-          <w:sz w:val="20"/>
-          <w:szCs w:val="20"/>
-          <w:highlight w:val="yellow"/>
-        </w:rPr>
-        <w:t>}}</w:t>
-      </w:r>
-      <w:r>
-        <w:rPr>
-          <w:rFonts w:ascii="Garamond" w:eastAsia="Garamond" w:hAnsi="Garamond" w:cs="Garamond"/>
-          <w:b/>
-          <w:bCs/>
-          <w:sz w:val="20"/>
-          <w:szCs w:val="20"/>
-        </w:rPr>
-        <w:t>,</w:t>
-      </w:r>
-      <w:r>
-        <w:rPr>
-          <w:rFonts w:ascii="Garamond" w:eastAsia="Garamond" w:hAnsi="Garamond" w:cs="Garamond"/>
-          <w:b/>
-          <w:bCs/>
-          <w:sz w:val="20"/>
-          <w:szCs w:val="20"/>
-        </w:rPr>
-        <w:t xml:space="preserve"> </w:t>
-      </w:r>
-      <w:r>
-        <w:rPr>
-          <w:rFonts w:ascii="Garamond" w:eastAsia="Garamond" w:hAnsi="Garamond" w:cs="Garamond"/>
-          <w:b/>
-          <w:bCs/>
-          <w:sz w:val="20"/>
-          <w:szCs w:val="20"/>
-        </w:rPr>
         <w:t xml:space="preserve">(EL “CESIONARIO”); Y TECNOLOGÍAS RAPPI, S.A.P.I. DE C.V., EN SU CARÁCTER DE CONTRATANTE CEDIDO, REPRESENTADA EN ESTE ACTO POR </w:t>
       </w:r>
       <w:r>
@@ -292,17 +196,7 @@
           <w:sz w:val="20"/>
           <w:szCs w:val="20"/>
         </w:rPr>
-        <w:t>IVÁN CADAVID SILVA</w:t>
-      </w:r>
-      <w:r>
-        <w:rPr>
-          <w:rFonts w:ascii="Garamond" w:eastAsia="Garamond" w:hAnsi="Garamond" w:cs="Garamond"/>
-          <w:b/>
-          <w:bCs/>
-          <w:sz w:val="20"/>
-          <w:szCs w:val="20"/>
-        </w:rPr>
-        <w:t xml:space="preserve"> </w:t>
+        <w:t xml:space="preserve">IVÁN CADAVID SILVA </w:t>
       </w:r>
       <w:r>
         <w:rPr>
@@ -414,65 +308,13 @@
         </w:rPr>
         <w:t xml:space="preserve"> El Acuerdo fue celebrado respecto de la(s) marca(s) denominada(s) comercialmente “</w:t>
       </w:r>
-      <w:proofErr w:type="gramStart"/>
       <w:r>
         <w:rPr>
           <w:rFonts w:ascii="Garamond" w:eastAsia="Garamond" w:hAnsi="Garamond" w:cs="Garamond"/>
           <w:sz w:val="21"/>
           <w:szCs w:val="21"/>
-          <w:highlight w:val="yellow"/>
-        </w:rPr>
-        <w:t xml:space="preserve">{{ </w:t>
-      </w:r>
-      <w:proofErr w:type="spellStart"/>
-      <w:r>
-        <w:rPr>
-          <w:rFonts w:ascii="Garamond" w:eastAsia="Garamond" w:hAnsi="Garamond" w:cs="Garamond"/>
-          <w:sz w:val="21"/>
-          <w:szCs w:val="21"/>
-          <w:highlight w:val="yellow"/>
-        </w:rPr>
-        <w:t>MARCA</w:t>
-      </w:r>
-      <w:proofErr w:type="gramEnd"/>
-      <w:r>
-        <w:rPr>
-          <w:rFonts w:ascii="Garamond" w:eastAsia="Garamond" w:hAnsi="Garamond" w:cs="Garamond"/>
-          <w:sz w:val="21"/>
-          <w:szCs w:val="21"/>
-          <w:highlight w:val="yellow"/>
-        </w:rPr>
-        <w:t>|</w:t>
-      </w:r>
-      <w:proofErr w:type="gramStart"/>
-      <w:r>
-        <w:rPr>
-          <w:rFonts w:ascii="Garamond" w:eastAsia="Garamond" w:hAnsi="Garamond" w:cs="Garamond"/>
-          <w:sz w:val="21"/>
-          <w:szCs w:val="21"/>
-          <w:highlight w:val="yellow"/>
-        </w:rPr>
-        <w:t>title</w:t>
-      </w:r>
-      <w:proofErr w:type="spellEnd"/>
-      <w:r>
-        <w:rPr>
-          <w:rFonts w:ascii="Garamond" w:eastAsia="Garamond" w:hAnsi="Garamond" w:cs="Garamond"/>
-          <w:sz w:val="21"/>
-          <w:szCs w:val="21"/>
-          <w:highlight w:val="yellow"/>
-        </w:rPr>
-        <w:t xml:space="preserve"> }</w:t>
-      </w:r>
-      <w:proofErr w:type="gramEnd"/>
-      <w:r>
-        <w:rPr>
-          <w:rFonts w:ascii="Garamond" w:eastAsia="Garamond" w:hAnsi="Garamond" w:cs="Garamond"/>
-          <w:sz w:val="21"/>
-          <w:szCs w:val="21"/>
-          <w:highlight w:val="yellow"/>
-        </w:rPr>
-        <w:t>}</w:t>
+        </w:rPr>
+        <w:t>{{ MARCA|title }}</w:t>
       </w:r>
       <w:r>
         <w:rPr>
@@ -594,29 +436,7 @@
           <w:sz w:val="20"/>
           <w:szCs w:val="20"/>
         </w:rPr>
-        <w:t>(</w:t>
-      </w:r>
-      <w:proofErr w:type="spellStart"/>
-      <w:r>
-        <w:rPr>
-          <w:rFonts w:ascii="Garamond" w:eastAsia="Garamond" w:hAnsi="Garamond" w:cs="Garamond"/>
-          <w:b/>
-          <w:bCs/>
-          <w:sz w:val="20"/>
-          <w:szCs w:val="20"/>
-        </w:rPr>
-        <w:t>ii</w:t>
-      </w:r>
-      <w:proofErr w:type="spellEnd"/>
-      <w:r>
-        <w:rPr>
-          <w:rFonts w:ascii="Garamond" w:eastAsia="Garamond" w:hAnsi="Garamond" w:cs="Garamond"/>
-          <w:b/>
-          <w:bCs/>
-          <w:sz w:val="20"/>
-          <w:szCs w:val="20"/>
-        </w:rPr>
-        <w:t>)</w:t>
+        <w:t>(ii)</w:t>
       </w:r>
       <w:r>
         <w:rPr>
@@ -644,29 +464,7 @@
           <w:sz w:val="20"/>
           <w:szCs w:val="20"/>
         </w:rPr>
-        <w:t>(</w:t>
-      </w:r>
-      <w:proofErr w:type="spellStart"/>
-      <w:r>
-        <w:rPr>
-          <w:rFonts w:ascii="Garamond" w:eastAsia="Garamond" w:hAnsi="Garamond" w:cs="Garamond"/>
-          <w:b/>
-          <w:bCs/>
-          <w:sz w:val="20"/>
-          <w:szCs w:val="20"/>
-        </w:rPr>
-        <w:t>iii</w:t>
-      </w:r>
-      <w:proofErr w:type="spellEnd"/>
-      <w:r>
-        <w:rPr>
-          <w:rFonts w:ascii="Garamond" w:eastAsia="Garamond" w:hAnsi="Garamond" w:cs="Garamond"/>
-          <w:b/>
-          <w:bCs/>
-          <w:sz w:val="20"/>
-          <w:szCs w:val="20"/>
-        </w:rPr>
-        <w:t>)</w:t>
+        <w:t>(iii)</w:t>
       </w:r>
       <w:r>
         <w:rPr>
@@ -694,29 +492,7 @@
           <w:sz w:val="20"/>
           <w:szCs w:val="20"/>
         </w:rPr>
-        <w:t>(</w:t>
-      </w:r>
-      <w:proofErr w:type="spellStart"/>
-      <w:r>
-        <w:rPr>
-          <w:rFonts w:ascii="Garamond" w:eastAsia="Garamond" w:hAnsi="Garamond" w:cs="Garamond"/>
-          <w:b/>
-          <w:bCs/>
-          <w:sz w:val="20"/>
-          <w:szCs w:val="20"/>
-        </w:rPr>
-        <w:t>iv</w:t>
-      </w:r>
-      <w:proofErr w:type="spellEnd"/>
-      <w:r>
-        <w:rPr>
-          <w:rFonts w:ascii="Garamond" w:eastAsia="Garamond" w:hAnsi="Garamond" w:cs="Garamond"/>
-          <w:b/>
-          <w:bCs/>
-          <w:sz w:val="20"/>
-          <w:szCs w:val="20"/>
-        </w:rPr>
-        <w:t>)</w:t>
+        <w:t>(iv)</w:t>
       </w:r>
       <w:r>
         <w:rPr>
@@ -916,25 +692,7 @@
           <w:sz w:val="20"/>
           <w:szCs w:val="20"/>
         </w:rPr>
-        <w:t xml:space="preserve"> La cesión surtirá efectos a partir de la fecha en que Rappi ejecute el cambio de titularidad de la Marca en la Plataforma Rappi (la “Fecha Efectiva”), la cual se acreditará con la firma del presente Contrato y el primer registro del Cesionario en Portal </w:t>
-      </w:r>
-      <w:proofErr w:type="spellStart"/>
-      <w:r>
-        <w:rPr>
-          <w:rFonts w:ascii="Garamond" w:eastAsia="Garamond" w:hAnsi="Garamond" w:cs="Garamond"/>
-          <w:sz w:val="20"/>
-          <w:szCs w:val="20"/>
-        </w:rPr>
-        <w:t>Partners</w:t>
-      </w:r>
-      <w:proofErr w:type="spellEnd"/>
-      <w:r>
-        <w:rPr>
-          <w:rFonts w:ascii="Garamond" w:eastAsia="Garamond" w:hAnsi="Garamond" w:cs="Garamond"/>
-          <w:sz w:val="20"/>
-          <w:szCs w:val="20"/>
-        </w:rPr>
-        <w:t>.</w:t>
+        <w:t xml:space="preserve"> La cesión surtirá efectos a partir de la fecha en que Rappi ejecute el cambio de titularidad de la Marca en la Plataforma Rappi (la “Fecha Efectiva”), la cual se acreditará con la firma del presente Contrato y el primer registro del Cesionario en Portal Partners.</w:t>
       </w:r>
     </w:p>
     <w:p>
@@ -1075,25 +833,7 @@
           <w:sz w:val="20"/>
           <w:szCs w:val="20"/>
         </w:rPr>
-        <w:t xml:space="preserve"> El Cedente se constituye como obligado solidario del Cesionario frente a Rappi respecto del cumplimiento de todas las obligaciones de pago derivadas del Acuerdo y del presente Contrato, por un plazo de seis (6) </w:t>
-      </w:r>
-      <w:proofErr w:type="gramStart"/>
-      <w:r>
-        <w:rPr>
-          <w:rFonts w:ascii="Garamond" w:eastAsia="Garamond" w:hAnsi="Garamond" w:cs="Garamond"/>
-          <w:sz w:val="20"/>
-          <w:szCs w:val="20"/>
-        </w:rPr>
-        <w:t>meses contado</w:t>
-      </w:r>
-      <w:proofErr w:type="gramEnd"/>
-      <w:r>
-        <w:rPr>
-          <w:rFonts w:ascii="Garamond" w:eastAsia="Garamond" w:hAnsi="Garamond" w:cs="Garamond"/>
-          <w:sz w:val="20"/>
-          <w:szCs w:val="20"/>
-        </w:rPr>
-        <w:t xml:space="preserve"> a partir de la Fecha Efectiva. En caso de incumplimiento del Cesionario, el Cedente se obliga a cubrir el adeudo mediante depósito directo en la cuenta que Rappi designe, dentro de los 15 (quince) días hábiles siguientes al requerimiento, sin necesidad de excusión ni orden previa. El Cedente suscribe el presente Contrato en señal de aceptación expresa de esta obligación.</w:t>
+        <w:t xml:space="preserve"> El Cedente se constituye como obligado solidario del Cesionario frente a Rappi respecto del cumplimiento de todas las obligaciones de pago derivadas del Acuerdo y del presente Contrato, por un plazo de seis (6) meses contado a partir de la Fecha Efectiva. En caso de incumplimiento del Cesionario, el Cedente se obliga a cubrir el adeudo mediante depósito directo en la cuenta que Rappi designe, dentro de los 15 (quince) días hábiles siguientes al requerimiento, sin necesidad de excusión ni orden previa. El Cedente suscribe el presente Contrato en señal de aceptación expresa de esta obligación.</w:t>
       </w:r>
     </w:p>
     <w:p>
@@ -1147,7 +887,6 @@
           <w:rFonts w:ascii="Garamond" w:eastAsia="Garamond" w:hAnsi="Garamond" w:cs="Garamond"/>
           <w:sz w:val="20"/>
           <w:szCs w:val="20"/>
-          <w:highlight w:val="yellow"/>
         </w:rPr>
       </w:pPr>
       <w:r>
@@ -1168,65 +907,13 @@
         </w:rPr>
         <w:t xml:space="preserve"> </w:t>
       </w:r>
-      <w:proofErr w:type="gramStart"/>
       <w:r>
         <w:rPr>
           <w:rFonts w:ascii="Garamond" w:eastAsia="Garamond" w:hAnsi="Garamond" w:cs="Garamond"/>
           <w:sz w:val="21"/>
           <w:szCs w:val="21"/>
-          <w:highlight w:val="yellow"/>
-        </w:rPr>
-        <w:t xml:space="preserve">{{ </w:t>
-      </w:r>
-      <w:proofErr w:type="spellStart"/>
-      <w:r>
-        <w:rPr>
-          <w:rFonts w:ascii="Garamond" w:eastAsia="Garamond" w:hAnsi="Garamond" w:cs="Garamond"/>
-          <w:sz w:val="21"/>
-          <w:szCs w:val="21"/>
-          <w:highlight w:val="yellow"/>
-        </w:rPr>
-        <w:t>NOMBRE</w:t>
-      </w:r>
-      <w:proofErr w:type="gramEnd"/>
-      <w:r>
-        <w:rPr>
-          <w:rFonts w:ascii="Garamond" w:eastAsia="Garamond" w:hAnsi="Garamond" w:cs="Garamond"/>
-          <w:sz w:val="21"/>
-          <w:szCs w:val="21"/>
-          <w:highlight w:val="yellow"/>
-        </w:rPr>
-        <w:t>_CESIONARIO|</w:t>
-      </w:r>
-      <w:proofErr w:type="gramStart"/>
-      <w:r>
-        <w:rPr>
-          <w:rFonts w:ascii="Garamond" w:eastAsia="Garamond" w:hAnsi="Garamond" w:cs="Garamond"/>
-          <w:sz w:val="21"/>
-          <w:szCs w:val="21"/>
-          <w:highlight w:val="yellow"/>
-        </w:rPr>
-        <w:t>upper</w:t>
-      </w:r>
-      <w:proofErr w:type="spellEnd"/>
-      <w:r>
-        <w:rPr>
-          <w:rFonts w:ascii="Garamond" w:eastAsia="Garamond" w:hAnsi="Garamond" w:cs="Garamond"/>
-          <w:sz w:val="21"/>
-          <w:szCs w:val="21"/>
-          <w:highlight w:val="yellow"/>
-        </w:rPr>
-        <w:t xml:space="preserve"> }</w:t>
-      </w:r>
-      <w:proofErr w:type="gramEnd"/>
-      <w:r>
-        <w:rPr>
-          <w:rFonts w:ascii="Garamond" w:eastAsia="Garamond" w:hAnsi="Garamond" w:cs="Garamond"/>
-          <w:sz w:val="21"/>
-          <w:szCs w:val="21"/>
-          <w:highlight w:val="yellow"/>
-        </w:rPr>
-        <w:t>}</w:t>
+        </w:rPr>
+        <w:t>{{ NOMBRE_CESIONARIO|upper }}</w:t>
       </w:r>
     </w:p>
     <w:p>
@@ -1245,7 +932,6 @@
           <w:rFonts w:ascii="Garamond" w:eastAsia="Garamond" w:hAnsi="Garamond" w:cs="Garamond"/>
           <w:sz w:val="20"/>
           <w:szCs w:val="20"/>
-          <w:highlight w:val="yellow"/>
         </w:rPr>
       </w:pPr>
       <w:r>
@@ -1266,59 +952,29 @@
         </w:rPr>
         <w:t xml:space="preserve"> </w:t>
       </w:r>
-      <w:proofErr w:type="gramStart"/>
-      <w:r>
-        <w:rPr>
-          <w:rFonts w:ascii="Garamond" w:eastAsia="Garamond" w:hAnsi="Garamond" w:cs="Garamond"/>
-          <w:sz w:val="20"/>
-          <w:szCs w:val="20"/>
-        </w:rPr>
-        <w:t xml:space="preserve">{{ </w:t>
-      </w:r>
-      <w:proofErr w:type="spellStart"/>
-      <w:r>
-        <w:rPr>
-          <w:rFonts w:ascii="Garamond" w:eastAsia="Garamond" w:hAnsi="Garamond" w:cs="Garamond"/>
-          <w:sz w:val="20"/>
-          <w:szCs w:val="20"/>
-        </w:rPr>
-        <w:t>BANCO</w:t>
-      </w:r>
-      <w:proofErr w:type="gramEnd"/>
-      <w:r>
-        <w:rPr>
-          <w:rFonts w:ascii="Garamond" w:eastAsia="Garamond" w:hAnsi="Garamond" w:cs="Garamond"/>
-          <w:sz w:val="20"/>
-          <w:szCs w:val="20"/>
-        </w:rPr>
-        <w:t>|</w:t>
-      </w:r>
-      <w:proofErr w:type="gramStart"/>
-      <w:r>
-        <w:rPr>
-          <w:rFonts w:ascii="Garamond" w:eastAsia="Garamond" w:hAnsi="Garamond" w:cs="Garamond"/>
-          <w:sz w:val="20"/>
-          <w:szCs w:val="20"/>
-        </w:rPr>
-        <w:t>upper</w:t>
-      </w:r>
-      <w:proofErr w:type="spellEnd"/>
-      <w:r>
-        <w:rPr>
-          <w:rFonts w:ascii="Garamond" w:eastAsia="Garamond" w:hAnsi="Garamond" w:cs="Garamond"/>
-          <w:sz w:val="20"/>
-          <w:szCs w:val="20"/>
-        </w:rPr>
-        <w:t xml:space="preserve"> }</w:t>
-      </w:r>
-      <w:proofErr w:type="gramEnd"/>
-      <w:r>
-        <w:rPr>
-          <w:rFonts w:ascii="Garamond" w:eastAsia="Garamond" w:hAnsi="Garamond" w:cs="Garamond"/>
-          <w:sz w:val="20"/>
-          <w:szCs w:val="20"/>
-        </w:rPr>
-        <w:t>}</w:t>
+      <w:r>
+        <w:rPr>
+          <w:rFonts w:ascii="Garamond" w:eastAsia="Garamond" w:hAnsi="Garamond" w:cs="Garamond"/>
+          <w:sz w:val="20"/>
+          <w:szCs w:val="20"/>
+        </w:rPr>
+        <w:t>{{ BANCO</w:t>
+      </w:r>
+      <w:r>
+        <w:rPr>
+          <w:rFonts w:ascii="Garamond" w:eastAsia="Garamond" w:hAnsi="Garamond" w:cs="Garamond"/>
+          <w:sz w:val="20"/>
+          <w:szCs w:val="20"/>
+        </w:rPr>
+        <w:t>|upper</w:t>
+      </w:r>
+      <w:r>
+        <w:rPr>
+          <w:rFonts w:ascii="Garamond" w:eastAsia="Garamond" w:hAnsi="Garamond" w:cs="Garamond"/>
+          <w:sz w:val="20"/>
+          <w:szCs w:val="20"/>
+        </w:rPr>
+        <w:t xml:space="preserve"> }}</w:t>
       </w:r>
     </w:p>
     <w:p>
@@ -1337,30 +993,17 @@
           <w:rFonts w:ascii="Garamond" w:eastAsia="Garamond" w:hAnsi="Garamond" w:cs="Garamond"/>
           <w:sz w:val="20"/>
           <w:szCs w:val="20"/>
-          <w:highlight w:val="yellow"/>
-        </w:rPr>
-      </w:pPr>
-      <w:proofErr w:type="spellStart"/>
-      <w:r>
-        <w:rPr>
-          <w:rFonts w:ascii="Garamond" w:eastAsia="Garamond" w:hAnsi="Garamond" w:cs="Garamond"/>
-          <w:b/>
-          <w:bCs/>
-          <w:sz w:val="20"/>
-          <w:szCs w:val="20"/>
-        </w:rPr>
-        <w:t>Clabe</w:t>
-      </w:r>
-      <w:proofErr w:type="spellEnd"/>
-      <w:r>
-        <w:rPr>
-          <w:rFonts w:ascii="Garamond" w:eastAsia="Garamond" w:hAnsi="Garamond" w:cs="Garamond"/>
-          <w:b/>
-          <w:bCs/>
-          <w:sz w:val="20"/>
-          <w:szCs w:val="20"/>
-        </w:rPr>
-        <w:t xml:space="preserve"> interbancaria:</w:t>
+        </w:rPr>
+      </w:pPr>
+      <w:r>
+        <w:rPr>
+          <w:rFonts w:ascii="Garamond" w:eastAsia="Garamond" w:hAnsi="Garamond" w:cs="Garamond"/>
+          <w:b/>
+          <w:bCs/>
+          <w:sz w:val="20"/>
+          <w:szCs w:val="20"/>
+        </w:rPr>
+        <w:t>Clabe interbancaria:</w:t>
       </w:r>
       <w:r>
         <w:rPr>
@@ -1370,45 +1013,13 @@
         </w:rPr>
         <w:t xml:space="preserve"> </w:t>
       </w:r>
-      <w:proofErr w:type="gramStart"/>
       <w:r>
         <w:rPr>
           <w:rFonts w:ascii="Garamond" w:eastAsia="Garamond" w:hAnsi="Garamond" w:cs="Garamond"/>
           <w:sz w:val="21"/>
           <w:szCs w:val="21"/>
-          <w:highlight w:val="yellow"/>
-        </w:rPr>
-        <w:t>{{ CLABE</w:t>
-      </w:r>
-      <w:proofErr w:type="gramEnd"/>
-      <w:r>
-        <w:rPr>
-          <w:rFonts w:ascii="Garamond" w:eastAsia="Garamond" w:hAnsi="Garamond" w:cs="Garamond"/>
-          <w:sz w:val="21"/>
-          <w:szCs w:val="21"/>
-          <w:highlight w:val="yellow"/>
-        </w:rPr>
-        <w:t>_</w:t>
-      </w:r>
-      <w:proofErr w:type="gramStart"/>
-      <w:r>
-        <w:rPr>
-          <w:rFonts w:ascii="Garamond" w:eastAsia="Garamond" w:hAnsi="Garamond" w:cs="Garamond"/>
-          <w:sz w:val="21"/>
-          <w:szCs w:val="21"/>
-          <w:highlight w:val="yellow"/>
-        </w:rPr>
-        <w:t>INTERBANCARIA }</w:t>
-      </w:r>
-      <w:proofErr w:type="gramEnd"/>
-      <w:r>
-        <w:rPr>
-          <w:rFonts w:ascii="Garamond" w:eastAsia="Garamond" w:hAnsi="Garamond" w:cs="Garamond"/>
-          <w:sz w:val="21"/>
-          <w:szCs w:val="21"/>
-          <w:highlight w:val="yellow"/>
-        </w:rPr>
-        <w:t>}</w:t>
+        </w:rPr>
+        <w:t>{{ CLABE_INTERBANCARIA }}</w:t>
       </w:r>
     </w:p>
     <w:p>
@@ -1427,7 +1038,6 @@
           <w:rFonts w:ascii="Garamond" w:eastAsia="Garamond" w:hAnsi="Garamond" w:cs="Garamond"/>
           <w:sz w:val="20"/>
           <w:szCs w:val="20"/>
-          <w:highlight w:val="yellow"/>
         </w:rPr>
       </w:pPr>
       <w:r>
@@ -1440,41 +1050,13 @@
         </w:rPr>
         <w:t xml:space="preserve">No. de cuenta bancaria: </w:t>
       </w:r>
-      <w:proofErr w:type="gramStart"/>
-      <w:r>
-        <w:rPr>
-          <w:rFonts w:ascii="Garamond" w:eastAsia="Garamond" w:hAnsi="Garamond" w:cs="Garamond"/>
-          <w:sz w:val="20"/>
-          <w:szCs w:val="20"/>
-        </w:rPr>
-        <w:t>{{ NUMERO</w:t>
-      </w:r>
-      <w:proofErr w:type="gramEnd"/>
-      <w:r>
-        <w:rPr>
-          <w:rFonts w:ascii="Garamond" w:eastAsia="Garamond" w:hAnsi="Garamond" w:cs="Garamond"/>
-          <w:sz w:val="20"/>
-          <w:szCs w:val="20"/>
-        </w:rPr>
-        <w:t>_</w:t>
-      </w:r>
-      <w:proofErr w:type="gramStart"/>
-      <w:r>
-        <w:rPr>
-          <w:rFonts w:ascii="Garamond" w:eastAsia="Garamond" w:hAnsi="Garamond" w:cs="Garamond"/>
-          <w:sz w:val="20"/>
-          <w:szCs w:val="20"/>
-        </w:rPr>
-        <w:t>CUENTA }</w:t>
-      </w:r>
-      <w:proofErr w:type="gramEnd"/>
-      <w:r>
-        <w:rPr>
-          <w:rFonts w:ascii="Garamond" w:eastAsia="Garamond" w:hAnsi="Garamond" w:cs="Garamond"/>
-          <w:sz w:val="20"/>
-          <w:szCs w:val="20"/>
-        </w:rPr>
-        <w:t>}</w:t>
+      <w:r>
+        <w:rPr>
+          <w:rFonts w:ascii="Garamond" w:eastAsia="Garamond" w:hAnsi="Garamond" w:cs="Garamond"/>
+          <w:sz w:val="20"/>
+          <w:szCs w:val="20"/>
+        </w:rPr>
+        <w:t>{{ NUMERO_CUENTA }}</w:t>
       </w:r>
     </w:p>
     <w:p>
@@ -1631,7 +1213,6 @@
           <w:rFonts w:ascii="Garamond" w:eastAsia="Garamond" w:hAnsi="Garamond" w:cs="Garamond"/>
           <w:sz w:val="20"/>
           <w:szCs w:val="20"/>
-          <w:highlight w:val="green"/>
         </w:rPr>
       </w:pPr>
       <w:r>
@@ -1683,7 +1264,6 @@
           <w:b/>
           <w:sz w:val="21"/>
           <w:szCs w:val="21"/>
-          <w:highlight w:val="yellow"/>
         </w:rPr>
         <w:t>{{ FECHA|</w:t>
       </w:r>
@@ -1693,7 +1273,6 @@
           <w:b/>
           <w:sz w:val="21"/>
           <w:szCs w:val="21"/>
-          <w:highlight w:val="yellow"/>
         </w:rPr>
         <w:t>lower</w:t>
       </w:r>
@@ -1703,7 +1282,6 @@
           <w:b/>
           <w:sz w:val="21"/>
           <w:szCs w:val="21"/>
-          <w:highlight w:val="yellow"/>
         </w:rPr>
         <w:t>}}</w:t>
       </w:r>
@@ -1783,7 +1361,6 @@
                 <w:rFonts w:ascii="Garamond" w:eastAsia="Garamond" w:hAnsi="Garamond" w:cs="Garamond"/>
                 <w:sz w:val="20"/>
                 <w:szCs w:val="20"/>
-                <w:highlight w:val="yellow"/>
               </w:rPr>
             </w:pPr>
           </w:p>
@@ -1801,7 +1378,6 @@
                 <w:rFonts w:ascii="Garamond" w:eastAsia="Garamond" w:hAnsi="Garamond" w:cs="Garamond"/>
                 <w:sz w:val="20"/>
                 <w:szCs w:val="20"/>
-                <w:highlight w:val="yellow"/>
               </w:rPr>
             </w:pPr>
           </w:p>
@@ -1819,7 +1395,6 @@
                 <w:rFonts w:ascii="Garamond" w:eastAsia="Garamond" w:hAnsi="Garamond" w:cs="Garamond"/>
                 <w:sz w:val="20"/>
                 <w:szCs w:val="20"/>
-                <w:highlight w:val="yellow"/>
               </w:rPr>
             </w:pPr>
           </w:p>
@@ -1862,10 +1437,8 @@
                 <w:rFonts w:ascii="Garamond" w:eastAsia="Garamond" w:hAnsi="Garamond" w:cs="Garamond"/>
                 <w:sz w:val="20"/>
                 <w:szCs w:val="20"/>
-                <w:highlight w:val="yellow"/>
               </w:rPr>
             </w:pPr>
-            <w:proofErr w:type="gramStart"/>
             <w:r>
               <w:rPr>
                 <w:rFonts w:ascii="Garamond" w:eastAsia="Garamond" w:hAnsi="Garamond" w:cs="Garamond"/>
@@ -1874,62 +1447,7 @@
                 <w:sz w:val="21"/>
                 <w:szCs w:val="21"/>
               </w:rPr>
-              <w:t xml:space="preserve">{{ </w:t>
-            </w:r>
-            <w:proofErr w:type="spellStart"/>
-            <w:r>
-              <w:rPr>
-                <w:rFonts w:ascii="Garamond" w:eastAsia="Garamond" w:hAnsi="Garamond" w:cs="Garamond"/>
-                <w:b/>
-                <w:bCs/>
-                <w:sz w:val="21"/>
-                <w:szCs w:val="21"/>
-              </w:rPr>
-              <w:t>NOMBRE</w:t>
-            </w:r>
-            <w:proofErr w:type="gramEnd"/>
-            <w:r>
-              <w:rPr>
-                <w:rFonts w:ascii="Garamond" w:eastAsia="Garamond" w:hAnsi="Garamond" w:cs="Garamond"/>
-                <w:b/>
-                <w:bCs/>
-                <w:sz w:val="21"/>
-                <w:szCs w:val="21"/>
-              </w:rPr>
-              <w:t>_CEDENTE|</w:t>
-            </w:r>
-            <w:proofErr w:type="gramStart"/>
-            <w:r>
-              <w:rPr>
-                <w:rFonts w:ascii="Garamond" w:eastAsia="Garamond" w:hAnsi="Garamond" w:cs="Garamond"/>
-                <w:b/>
-                <w:bCs/>
-                <w:sz w:val="21"/>
-                <w:szCs w:val="21"/>
-              </w:rPr>
-              <w:t>title</w:t>
-            </w:r>
-            <w:proofErr w:type="spellEnd"/>
-            <w:r>
-              <w:rPr>
-                <w:rFonts w:ascii="Garamond" w:eastAsia="Garamond" w:hAnsi="Garamond" w:cs="Garamond"/>
-                <w:b/>
-                <w:bCs/>
-                <w:sz w:val="21"/>
-                <w:szCs w:val="21"/>
-              </w:rPr>
-              <w:t xml:space="preserve"> }</w:t>
-            </w:r>
-            <w:proofErr w:type="gramEnd"/>
-            <w:r>
-              <w:rPr>
-                <w:rFonts w:ascii="Garamond" w:eastAsia="Garamond" w:hAnsi="Garamond" w:cs="Garamond"/>
-                <w:b/>
-                <w:bCs/>
-                <w:sz w:val="21"/>
-                <w:szCs w:val="21"/>
-              </w:rPr>
-              <w:t>}</w:t>
+              <w:t>{{ NOMBRE_CEDENTE|title }}</w:t>
             </w:r>
           </w:p>
           <w:p>
@@ -2028,7 +1546,6 @@
                 <w:rFonts w:ascii="Garamond" w:eastAsia="Garamond" w:hAnsi="Garamond" w:cs="Garamond"/>
                 <w:sz w:val="20"/>
                 <w:szCs w:val="20"/>
-                <w:highlight w:val="yellow"/>
               </w:rPr>
             </w:pPr>
           </w:p>
@@ -2046,7 +1563,6 @@
                 <w:rFonts w:ascii="Garamond" w:eastAsia="Garamond" w:hAnsi="Garamond" w:cs="Garamond"/>
                 <w:sz w:val="20"/>
                 <w:szCs w:val="20"/>
-                <w:highlight w:val="yellow"/>
               </w:rPr>
             </w:pPr>
           </w:p>
@@ -2064,7 +1580,6 @@
                 <w:rFonts w:ascii="Garamond" w:eastAsia="Garamond" w:hAnsi="Garamond" w:cs="Garamond"/>
                 <w:sz w:val="20"/>
                 <w:szCs w:val="20"/>
-                <w:highlight w:val="yellow"/>
               </w:rPr>
             </w:pPr>
           </w:p>
@@ -2108,7 +1623,6 @@
                 <w:szCs w:val="21"/>
               </w:rPr>
             </w:pPr>
-            <w:proofErr w:type="gramStart"/>
             <w:r>
               <w:rPr>
                 <w:rFonts w:ascii="Garamond" w:eastAsia="Garamond" w:hAnsi="Garamond" w:cs="Garamond"/>
@@ -2117,62 +1631,7 @@
                 <w:sz w:val="21"/>
                 <w:szCs w:val="21"/>
               </w:rPr>
-              <w:t xml:space="preserve">{{ </w:t>
-            </w:r>
-            <w:proofErr w:type="spellStart"/>
-            <w:r>
-              <w:rPr>
-                <w:rFonts w:ascii="Garamond" w:eastAsia="Garamond" w:hAnsi="Garamond" w:cs="Garamond"/>
-                <w:b/>
-                <w:bCs/>
-                <w:sz w:val="21"/>
-                <w:szCs w:val="21"/>
-              </w:rPr>
-              <w:t>NOMBRE</w:t>
-            </w:r>
-            <w:proofErr w:type="gramEnd"/>
-            <w:r>
-              <w:rPr>
-                <w:rFonts w:ascii="Garamond" w:eastAsia="Garamond" w:hAnsi="Garamond" w:cs="Garamond"/>
-                <w:b/>
-                <w:bCs/>
-                <w:sz w:val="21"/>
-                <w:szCs w:val="21"/>
-              </w:rPr>
-              <w:t>_CESIONARIO|</w:t>
-            </w:r>
-            <w:proofErr w:type="gramStart"/>
-            <w:r>
-              <w:rPr>
-                <w:rFonts w:ascii="Garamond" w:eastAsia="Garamond" w:hAnsi="Garamond" w:cs="Garamond"/>
-                <w:b/>
-                <w:bCs/>
-                <w:sz w:val="21"/>
-                <w:szCs w:val="21"/>
-              </w:rPr>
-              <w:t>title</w:t>
-            </w:r>
-            <w:proofErr w:type="spellEnd"/>
-            <w:r>
-              <w:rPr>
-                <w:rFonts w:ascii="Garamond" w:eastAsia="Garamond" w:hAnsi="Garamond" w:cs="Garamond"/>
-                <w:b/>
-                <w:bCs/>
-                <w:sz w:val="21"/>
-                <w:szCs w:val="21"/>
-              </w:rPr>
-              <w:t xml:space="preserve"> }</w:t>
-            </w:r>
-            <w:proofErr w:type="gramEnd"/>
-            <w:r>
-              <w:rPr>
-                <w:rFonts w:ascii="Garamond" w:eastAsia="Garamond" w:hAnsi="Garamond" w:cs="Garamond"/>
-                <w:b/>
-                <w:bCs/>
-                <w:sz w:val="21"/>
-                <w:szCs w:val="21"/>
-              </w:rPr>
-              <w:t>}</w:t>
+              <w:t>{{ NOMBRE_CESIONARIO|title }}</w:t>
             </w:r>
           </w:p>
           <w:p>
@@ -2399,29 +1858,7 @@
                 <w:szCs w:val="21"/>
                 <w:lang w:val="pt-BR"/>
               </w:rPr>
-              <w:t xml:space="preserve">Iván </w:t>
-            </w:r>
-            <w:proofErr w:type="spellStart"/>
-            <w:r>
-              <w:rPr>
-                <w:rFonts w:ascii="Garamond" w:eastAsia="Garamond" w:hAnsi="Garamond" w:cs="Garamond"/>
-                <w:b/>
-                <w:sz w:val="21"/>
-                <w:szCs w:val="21"/>
-                <w:lang w:val="pt-BR"/>
-              </w:rPr>
-              <w:t>Cadavid</w:t>
-            </w:r>
-            <w:proofErr w:type="spellEnd"/>
-            <w:r>
-              <w:rPr>
-                <w:rFonts w:ascii="Garamond" w:eastAsia="Garamond" w:hAnsi="Garamond" w:cs="Garamond"/>
-                <w:b/>
-                <w:sz w:val="21"/>
-                <w:szCs w:val="21"/>
-                <w:lang w:val="pt-BR"/>
-              </w:rPr>
-              <w:t xml:space="preserve"> Silva</w:t>
+              <w:t>Iván Cadavid Silva</w:t>
             </w:r>
           </w:p>
           <w:p>

</xml_diff>